<commit_message>
Pin Data Availability to commit 4bfe45f
</commit_message>
<xml_diff>
--- a/docs/Supervised_distribution_divergence_guided_omics_imaging_manuscript_Genes_MDPI.docx
+++ b/docs/Supervised_distribution_divergence_guided_omics_imaging_manuscript_Genes_MDPI.docx
@@ -4737,12 +4737,7 @@
         <w:jc w:val="both"/>
       </w:pPr>
       <w:r>
-        <w:rPr>
-          <w:rFonts w:ascii="Times New Roman" w:hAnsi="Times New Roman" w:eastAsia="宋体" w:cs="Times New Roman"/>
-          <w:b w:val="0"/>
-          <w:sz w:val="22"/>
-        </w:rPr>
-        <w:t>The raw public data are available from the NCI Genomic Data Commons (project TCGA-BRCA) and UCSC Xena. Processed data, feature-selection and modeling code, JSD images, result tables, supplementary material, and reproducibility notes are available in the GitHub repository Supervised_distribution_divergence_omics_imaging_breast_cancer (https://github.com/381521602/Supervised_distribution_divergence_omics_imaging_breast_cancer), archived at commit e74de48.</w:t>
+        <w:t>The raw public data are available from the NCI Genomic Data Commons (project TCGA-BRCA) and UCSC Xena. Processed data, feature-selection and modeling code, JSD images, result tables, supplementary material, and reproducibility notes are available in the GitHub repository Supervised_distribution_divergence_omics_imaging_breast_cancer (https://github.com/381521602/Supervised_distribution_divergence_omics_imaging_breast_cancer), archived at commit 4bfe45f.</w:t>
       </w:r>
     </w:p>
     <w:p>

</xml_diff>